<commit_message>
feat: simplify assurance workflow and redesign product UI
</commit_message>
<xml_diff>
--- a/demo-evidence-fixtures/realistic-pmo-cases/case_01_green_riverside_data_hub/01_project_baseline.docx
+++ b/demo-evidence-fixtures/realistic-pmo-cases/case_01_green_riverside_data_hub/01_project_baseline.docx
@@ -4,30 +4,48 @@
   <w:body>
     <w:p>
       <w:pPr>
-        <w:jc w:val="left"/>
+        <w:spacing w:after="60"/>
       </w:pPr>
       <w:r>
         <w:rPr>
-          <w:rFonts w:ascii="Arial" w:hAnsi="Arial"/>
+          <w:rFonts w:ascii="Calibri" w:hAnsi="Calibri"/>
           <w:b/>
-          <w:color w:val="1F4E79"/>
-          <w:sz w:val="44"/>
+          <w:color w:val="0F172A"/>
+          <w:sz w:val="48"/>
         </w:rPr>
         <w:t>Project Baseline</w:t>
       </w:r>
     </w:p>
     <w:p>
+      <w:pPr>
+        <w:spacing w:after="60"/>
+      </w:pPr>
       <w:r>
         <w:rPr>
-          <w:color w:val="595959"/>
-          <w:sz w:val="22"/>
+          <w:rFonts w:ascii="Calibri" w:hAnsi="Calibri"/>
+          <w:b/>
+          <w:color w:val="1D4ED8"/>
+          <w:sz w:val="28"/>
         </w:rPr>
         <w:t>Riverside Data Hub</w:t>
       </w:r>
     </w:p>
     <w:p>
+      <w:pPr>
+        <w:spacing w:after="280"/>
+      </w:pPr>
       <w:r>
-        <w:t>This baseline defines the approved delivery reference used by the PMO to compare current performance against expected schedule, cost, governance, and assurance evidence.</w:t>
+        <w:rPr>
+          <w:rFonts w:ascii="Calibri" w:hAnsi="Calibri"/>
+          <w:color w:val="475569"/>
+          <w:sz w:val="18"/>
+        </w:rPr>
+        <w:t>Approval status: Approved | Assurance cadence: Monthly</w:t>
+      </w:r>
+    </w:p>
+    <w:p>
+      <w:r>
+        <w:t>This document is the approved reference for cost, schedule, and risk comparison. Current reports must not replace these baseline values.</w:t>
       </w:r>
     </w:p>
     <w:p>
@@ -35,29 +53,48 @@
         <w:pStyle w:val="Heading1"/>
       </w:pPr>
       <w:r>
-        <w:t>Project Control Profile</w:t>
+        <w:t>Approved control profile</w:t>
       </w:r>
     </w:p>
     <w:tbl>
       <w:tblPr>
         <w:tblStyle w:val="TableGrid"/>
-        <w:tblW w:type="auto" w:w="0"/>
+        <w:tblW w:type="dxa" w:w="9360"/>
+        <w:jc w:val="left"/>
+        <w:tblLayout w:type="fixed"/>
         <w:tblLook w:firstColumn="1" w:firstRow="1" w:lastColumn="0" w:lastRow="0" w:noHBand="0" w:noVBand="1" w:val="04A0"/>
+        <w:tblInd w:w="120" w:type="dxa"/>
       </w:tblPr>
       <w:tblGrid>
-        <w:gridCol w:w="4320"/>
-        <w:gridCol w:w="4320"/>
+        <w:gridCol w:w="4680"/>
+        <w:gridCol w:w="4680"/>
       </w:tblGrid>
       <w:tr>
+        <w:trPr>
+          <w:tblHeader w:val="true"/>
+        </w:trPr>
         <w:tc>
           <w:tcPr>
-            <w:tcW w:type="dxa" w:w="2880"/>
-            <w:shd w:fill="D9EAF7"/>
+            <w:tcW w:type="dxa" w:w="2736"/>
+            <w:vAlign w:val="center"/>
+            <w:shd w:fill="F1F5F9"/>
+            <w:tcMar>
+              <w:top w:w="80" w:type="dxa"/>
+              <w:start w:w="120" w:type="dxa"/>
+              <w:bottom w:w="80" w:type="dxa"/>
+              <w:end w:w="120" w:type="dxa"/>
+            </w:tcMar>
           </w:tcPr>
           <w:p>
+            <w:pPr>
+              <w:spacing w:after="0"/>
+            </w:pPr>
             <w:r>
               <w:rPr>
+                <w:rFonts w:ascii="Calibri" w:hAnsi="Calibri"/>
                 <w:b/>
+                <w:color w:val="0F172A"/>
+                <w:sz w:val="18"/>
               </w:rPr>
               <w:t>Field</w:t>
             </w:r>
@@ -65,15 +102,28 @@
         </w:tc>
         <w:tc>
           <w:tcPr>
-            <w:tcW w:type="dxa" w:w="6912"/>
-            <w:shd w:fill="D9EAF7"/>
+            <w:tcW w:type="dxa" w:w="6624"/>
+            <w:vAlign w:val="center"/>
+            <w:shd w:fill="F1F5F9"/>
+            <w:tcMar>
+              <w:top w:w="80" w:type="dxa"/>
+              <w:start w:w="120" w:type="dxa"/>
+              <w:bottom w:w="80" w:type="dxa"/>
+              <w:end w:w="120" w:type="dxa"/>
+            </w:tcMar>
           </w:tcPr>
           <w:p>
+            <w:pPr>
+              <w:spacing w:after="0"/>
+            </w:pPr>
             <w:r>
               <w:rPr>
+                <w:rFonts w:ascii="Calibri" w:hAnsi="Calibri"/>
                 <w:b/>
+                <w:color w:val="0F172A"/>
+                <w:sz w:val="18"/>
               </w:rPr>
-              <w:t>Value</w:t>
+              <w:t>Approved value</w:t>
             </w:r>
           </w:p>
         </w:tc>
@@ -81,20 +131,50 @@
       <w:tr>
         <w:tc>
           <w:tcPr>
-            <w:tcW w:type="dxa" w:w="2880"/>
+            <w:tcW w:type="dxa" w:w="2736"/>
+            <w:vAlign w:val="center"/>
+            <w:tcMar>
+              <w:top w:w="80" w:type="dxa"/>
+              <w:start w:w="120" w:type="dxa"/>
+              <w:bottom w:w="80" w:type="dxa"/>
+              <w:end w:w="120" w:type="dxa"/>
+            </w:tcMar>
           </w:tcPr>
           <w:p>
+            <w:pPr>
+              <w:spacing w:after="0"/>
+            </w:pPr>
             <w:r>
-              <w:t>Project Name</w:t>
+              <w:rPr>
+                <w:rFonts w:ascii="Calibri" w:hAnsi="Calibri"/>
+                <w:color w:val="0F172A"/>
+                <w:sz w:val="18"/>
+              </w:rPr>
+              <w:t>Project</w:t>
             </w:r>
           </w:p>
         </w:tc>
         <w:tc>
           <w:tcPr>
-            <w:tcW w:type="dxa" w:w="6912"/>
+            <w:tcW w:type="dxa" w:w="6624"/>
+            <w:vAlign w:val="center"/>
+            <w:tcMar>
+              <w:top w:w="80" w:type="dxa"/>
+              <w:start w:w="120" w:type="dxa"/>
+              <w:bottom w:w="80" w:type="dxa"/>
+              <w:end w:w="120" w:type="dxa"/>
+            </w:tcMar>
           </w:tcPr>
           <w:p>
+            <w:pPr>
+              <w:spacing w:after="0"/>
+            </w:pPr>
             <w:r>
+              <w:rPr>
+                <w:rFonts w:ascii="Calibri" w:hAnsi="Calibri"/>
+                <w:color w:val="0F172A"/>
+                <w:sz w:val="18"/>
+              </w:rPr>
               <w:t>Riverside Data Hub</w:t>
             </w:r>
           </w:p>
@@ -103,20 +183,50 @@
       <w:tr>
         <w:tc>
           <w:tcPr>
-            <w:tcW w:type="dxa" w:w="2880"/>
+            <w:tcW w:type="dxa" w:w="2736"/>
+            <w:vAlign w:val="center"/>
+            <w:tcMar>
+              <w:top w:w="80" w:type="dxa"/>
+              <w:start w:w="120" w:type="dxa"/>
+              <w:bottom w:w="80" w:type="dxa"/>
+              <w:end w:w="120" w:type="dxa"/>
+            </w:tcMar>
           </w:tcPr>
           <w:p>
+            <w:pPr>
+              <w:spacing w:after="0"/>
+            </w:pPr>
             <w:r>
+              <w:rPr>
+                <w:rFonts w:ascii="Calibri" w:hAnsi="Calibri"/>
+                <w:color w:val="0F172A"/>
+                <w:sz w:val="18"/>
+              </w:rPr>
               <w:t>Sector</w:t>
             </w:r>
           </w:p>
         </w:tc>
         <w:tc>
           <w:tcPr>
-            <w:tcW w:type="dxa" w:w="6912"/>
+            <w:tcW w:type="dxa" w:w="6624"/>
+            <w:vAlign w:val="center"/>
+            <w:tcMar>
+              <w:top w:w="80" w:type="dxa"/>
+              <w:start w:w="120" w:type="dxa"/>
+              <w:bottom w:w="80" w:type="dxa"/>
+              <w:end w:w="120" w:type="dxa"/>
+            </w:tcMar>
           </w:tcPr>
           <w:p>
+            <w:pPr>
+              <w:spacing w:after="0"/>
+            </w:pPr>
             <w:r>
+              <w:rPr>
+                <w:rFonts w:ascii="Calibri" w:hAnsi="Calibri"/>
+                <w:color w:val="0F172A"/>
+                <w:sz w:val="18"/>
+              </w:rPr>
               <w:t>Digital services and data platform</w:t>
             </w:r>
           </w:p>
@@ -125,20 +235,50 @@
       <w:tr>
         <w:tc>
           <w:tcPr>
-            <w:tcW w:type="dxa" w:w="2880"/>
+            <w:tcW w:type="dxa" w:w="2736"/>
+            <w:vAlign w:val="center"/>
+            <w:tcMar>
+              <w:top w:w="80" w:type="dxa"/>
+              <w:start w:w="120" w:type="dxa"/>
+              <w:bottom w:w="80" w:type="dxa"/>
+              <w:end w:w="120" w:type="dxa"/>
+            </w:tcMar>
           </w:tcPr>
           <w:p>
+            <w:pPr>
+              <w:spacing w:after="0"/>
+            </w:pPr>
             <w:r>
+              <w:rPr>
+                <w:rFonts w:ascii="Calibri" w:hAnsi="Calibri"/>
+                <w:color w:val="0F172A"/>
+                <w:sz w:val="18"/>
+              </w:rPr>
               <w:t>Sponsor</w:t>
             </w:r>
           </w:p>
         </w:tc>
         <w:tc>
           <w:tcPr>
-            <w:tcW w:type="dxa" w:w="6912"/>
+            <w:tcW w:type="dxa" w:w="6624"/>
+            <w:vAlign w:val="center"/>
+            <w:tcMar>
+              <w:top w:w="80" w:type="dxa"/>
+              <w:start w:w="120" w:type="dxa"/>
+              <w:bottom w:w="80" w:type="dxa"/>
+              <w:end w:w="120" w:type="dxa"/>
+            </w:tcMar>
           </w:tcPr>
           <w:p>
+            <w:pPr>
+              <w:spacing w:after="0"/>
+            </w:pPr>
             <w:r>
+              <w:rPr>
+                <w:rFonts w:ascii="Calibri" w:hAnsi="Calibri"/>
+                <w:color w:val="0F172A"/>
+                <w:sz w:val="18"/>
+              </w:rPr>
               <w:t>Customer Operations Directorate</w:t>
             </w:r>
           </w:p>
@@ -147,20 +287,50 @@
       <w:tr>
         <w:tc>
           <w:tcPr>
-            <w:tcW w:type="dxa" w:w="2880"/>
+            <w:tcW w:type="dxa" w:w="2736"/>
+            <w:vAlign w:val="center"/>
+            <w:tcMar>
+              <w:top w:w="80" w:type="dxa"/>
+              <w:start w:w="120" w:type="dxa"/>
+              <w:bottom w:w="80" w:type="dxa"/>
+              <w:end w:w="120" w:type="dxa"/>
+            </w:tcMar>
           </w:tcPr>
           <w:p>
+            <w:pPr>
+              <w:spacing w:after="0"/>
+            </w:pPr>
             <w:r>
-              <w:t>Project Manager</w:t>
+              <w:rPr>
+                <w:rFonts w:ascii="Calibri" w:hAnsi="Calibri"/>
+                <w:color w:val="0F172A"/>
+                <w:sz w:val="18"/>
+              </w:rPr>
+              <w:t>Project manager</w:t>
             </w:r>
           </w:p>
         </w:tc>
         <w:tc>
           <w:tcPr>
-            <w:tcW w:type="dxa" w:w="6912"/>
+            <w:tcW w:type="dxa" w:w="6624"/>
+            <w:vAlign w:val="center"/>
+            <w:tcMar>
+              <w:top w:w="80" w:type="dxa"/>
+              <w:start w:w="120" w:type="dxa"/>
+              <w:bottom w:w="80" w:type="dxa"/>
+              <w:end w:w="120" w:type="dxa"/>
+            </w:tcMar>
           </w:tcPr>
           <w:p>
+            <w:pPr>
+              <w:spacing w:after="0"/>
+            </w:pPr>
             <w:r>
+              <w:rPr>
+                <w:rFonts w:ascii="Calibri" w:hAnsi="Calibri"/>
+                <w:color w:val="0F172A"/>
+                <w:sz w:val="18"/>
+              </w:rPr>
               <w:t>Maya Prasetyo</w:t>
             </w:r>
           </w:p>
@@ -169,21 +339,51 @@
       <w:tr>
         <w:tc>
           <w:tcPr>
-            <w:tcW w:type="dxa" w:w="2880"/>
+            <w:tcW w:type="dxa" w:w="2736"/>
+            <w:vAlign w:val="center"/>
+            <w:tcMar>
+              <w:top w:w="80" w:type="dxa"/>
+              <w:start w:w="120" w:type="dxa"/>
+              <w:bottom w:w="80" w:type="dxa"/>
+              <w:end w:w="120" w:type="dxa"/>
+            </w:tcMar>
           </w:tcPr>
           <w:p>
+            <w:pPr>
+              <w:spacing w:after="0"/>
+            </w:pPr>
             <w:r>
-              <w:t>Baseline Budget USD</w:t>
+              <w:rPr>
+                <w:rFonts w:ascii="Calibri" w:hAnsi="Calibri"/>
+                <w:color w:val="0F172A"/>
+                <w:sz w:val="18"/>
+              </w:rPr>
+              <w:t>Approved budget</w:t>
             </w:r>
           </w:p>
         </w:tc>
         <w:tc>
           <w:tcPr>
-            <w:tcW w:type="dxa" w:w="6912"/>
+            <w:tcW w:type="dxa" w:w="6624"/>
+            <w:vAlign w:val="center"/>
+            <w:tcMar>
+              <w:top w:w="80" w:type="dxa"/>
+              <w:start w:w="120" w:type="dxa"/>
+              <w:bottom w:w="80" w:type="dxa"/>
+              <w:end w:w="120" w:type="dxa"/>
+            </w:tcMar>
           </w:tcPr>
           <w:p>
+            <w:pPr>
+              <w:spacing w:after="0"/>
+            </w:pPr>
             <w:r>
-              <w:t>500,000</w:t>
+              <w:rPr>
+                <w:rFonts w:ascii="Calibri" w:hAnsi="Calibri"/>
+                <w:color w:val="0F172A"/>
+                <w:sz w:val="18"/>
+              </w:rPr>
+              <w:t>USD 500,000</w:t>
             </w:r>
           </w:p>
         </w:tc>
@@ -191,21 +391,103 @@
       <w:tr>
         <w:tc>
           <w:tcPr>
-            <w:tcW w:type="dxa" w:w="2880"/>
+            <w:tcW w:type="dxa" w:w="2736"/>
+            <w:vAlign w:val="center"/>
+            <w:tcMar>
+              <w:top w:w="80" w:type="dxa"/>
+              <w:start w:w="120" w:type="dxa"/>
+              <w:bottom w:w="80" w:type="dxa"/>
+              <w:end w:w="120" w:type="dxa"/>
+            </w:tcMar>
           </w:tcPr>
           <w:p>
+            <w:pPr>
+              <w:spacing w:after="0"/>
+            </w:pPr>
             <w:r>
-              <w:t>Assurance Cadence</w:t>
+              <w:rPr>
+                <w:rFonts w:ascii="Calibri" w:hAnsi="Calibri"/>
+                <w:color w:val="0F172A"/>
+                <w:sz w:val="18"/>
+              </w:rPr>
+              <w:t>Approved milestone</w:t>
             </w:r>
           </w:p>
         </w:tc>
         <w:tc>
           <w:tcPr>
-            <w:tcW w:type="dxa" w:w="6912"/>
+            <w:tcW w:type="dxa" w:w="6624"/>
+            <w:vAlign w:val="center"/>
+            <w:tcMar>
+              <w:top w:w="80" w:type="dxa"/>
+              <w:start w:w="120" w:type="dxa"/>
+              <w:bottom w:w="80" w:type="dxa"/>
+              <w:end w:w="120" w:type="dxa"/>
+            </w:tcMar>
           </w:tcPr>
           <w:p>
+            <w:pPr>
+              <w:spacing w:after="0"/>
+            </w:pPr>
             <w:r>
-              <w:t>Monthly PMO checkpoint with evidence-backed executive summary</w:t>
+              <w:rPr>
+                <w:rFonts w:ascii="Calibri" w:hAnsi="Calibri"/>
+                <w:color w:val="0F172A"/>
+                <w:sz w:val="18"/>
+              </w:rPr>
+              <w:t>Operational readiness review</w:t>
+            </w:r>
+          </w:p>
+        </w:tc>
+      </w:tr>
+      <w:tr>
+        <w:tc>
+          <w:tcPr>
+            <w:tcW w:type="dxa" w:w="2736"/>
+            <w:vAlign w:val="center"/>
+            <w:tcMar>
+              <w:top w:w="80" w:type="dxa"/>
+              <w:start w:w="120" w:type="dxa"/>
+              <w:bottom w:w="80" w:type="dxa"/>
+              <w:end w:w="120" w:type="dxa"/>
+            </w:tcMar>
+          </w:tcPr>
+          <w:p>
+            <w:pPr>
+              <w:spacing w:after="0"/>
+            </w:pPr>
+            <w:r>
+              <w:rPr>
+                <w:rFonts w:ascii="Calibri" w:hAnsi="Calibri"/>
+                <w:color w:val="0F172A"/>
+                <w:sz w:val="18"/>
+              </w:rPr>
+              <w:t>Approved milestone date</w:t>
+            </w:r>
+          </w:p>
+        </w:tc>
+        <w:tc>
+          <w:tcPr>
+            <w:tcW w:type="dxa" w:w="6624"/>
+            <w:vAlign w:val="center"/>
+            <w:tcMar>
+              <w:top w:w="80" w:type="dxa"/>
+              <w:start w:w="120" w:type="dxa"/>
+              <w:bottom w:w="80" w:type="dxa"/>
+              <w:end w:w="120" w:type="dxa"/>
+            </w:tcMar>
+          </w:tcPr>
+          <w:p>
+            <w:pPr>
+              <w:spacing w:after="0"/>
+            </w:pPr>
+            <w:r>
+              <w:rPr>
+                <w:rFonts w:ascii="Calibri" w:hAnsi="Calibri"/>
+                <w:color w:val="0F172A"/>
+                <w:sz w:val="18"/>
+              </w:rPr>
+              <w:t>2026-04-18</w:t>
             </w:r>
           </w:p>
         </w:tc>
@@ -217,75 +499,90 @@
         <w:pStyle w:val="Heading1"/>
       </w:pPr>
       <w:r>
-        <w:t>Baseline Milestones</w:t>
+        <w:t>Approved risk posture</w:t>
+      </w:r>
+    </w:p>
+    <w:p>
+      <w:r>
+        <w:t>The approved plan contains no critical risks. One high operational readiness risk has a named owner and an approved mitigation.</w:t>
+      </w:r>
+    </w:p>
+    <w:p>
+      <w:pPr>
+        <w:pStyle w:val="Heading1"/>
+      </w:pPr>
+      <w:r>
+        <w:t>Assurance requirements</w:t>
       </w:r>
     </w:p>
     <w:tbl>
       <w:tblPr>
         <w:tblStyle w:val="TableGrid"/>
-        <w:tblW w:type="auto" w:w="0"/>
+        <w:tblW w:type="dxa" w:w="9360"/>
+        <w:jc w:val="left"/>
+        <w:tblLayout w:type="fixed"/>
         <w:tblLook w:firstColumn="1" w:firstRow="1" w:lastColumn="0" w:lastRow="0" w:noHBand="0" w:noVBand="1" w:val="04A0"/>
+        <w:tblInd w:w="120" w:type="dxa"/>
       </w:tblPr>
       <w:tblGrid>
-        <w:gridCol w:w="2160"/>
-        <w:gridCol w:w="2160"/>
-        <w:gridCol w:w="2160"/>
-        <w:gridCol w:w="2160"/>
+        <w:gridCol w:w="4680"/>
+        <w:gridCol w:w="4680"/>
       </w:tblGrid>
       <w:tr>
+        <w:trPr>
+          <w:tblHeader w:val="true"/>
+        </w:trPr>
         <w:tc>
           <w:tcPr>
-            <w:tcW w:type="dxa" w:w="3456"/>
-            <w:shd w:fill="D9EAF7"/>
+            <w:tcW w:type="dxa" w:w="2016"/>
+            <w:vAlign w:val="center"/>
+            <w:shd w:fill="F1F5F9"/>
+            <w:tcMar>
+              <w:top w:w="80" w:type="dxa"/>
+              <w:start w:w="120" w:type="dxa"/>
+              <w:bottom w:w="80" w:type="dxa"/>
+              <w:end w:w="120" w:type="dxa"/>
+            </w:tcMar>
           </w:tcPr>
           <w:p>
+            <w:pPr>
+              <w:spacing w:after="0"/>
+            </w:pPr>
             <w:r>
               <w:rPr>
+                <w:rFonts w:ascii="Calibri" w:hAnsi="Calibri"/>
                 <w:b/>
+                <w:color w:val="0F172A"/>
+                <w:sz w:val="18"/>
               </w:rPr>
-              <w:t>Milestone</w:t>
+              <w:t>Control</w:t>
             </w:r>
           </w:p>
         </w:tc>
         <w:tc>
           <w:tcPr>
-            <w:tcW w:type="dxa" w:w="1728"/>
-            <w:shd w:fill="D9EAF7"/>
+            <w:tcW w:type="dxa" w:w="7344"/>
+            <w:vAlign w:val="center"/>
+            <w:shd w:fill="F1F5F9"/>
+            <w:tcMar>
+              <w:top w:w="80" w:type="dxa"/>
+              <w:start w:w="120" w:type="dxa"/>
+              <w:bottom w:w="80" w:type="dxa"/>
+              <w:end w:w="120" w:type="dxa"/>
+            </w:tcMar>
           </w:tcPr>
           <w:p>
+            <w:pPr>
+              <w:spacing w:after="0"/>
+            </w:pPr>
             <w:r>
               <w:rPr>
+                <w:rFonts w:ascii="Calibri" w:hAnsi="Calibri"/>
                 <w:b/>
+                <w:color w:val="0F172A"/>
+                <w:sz w:val="18"/>
               </w:rPr>
-              <w:t>Baseline Date</w:t>
-            </w:r>
-          </w:p>
-        </w:tc>
-        <w:tc>
-          <w:tcPr>
-            <w:tcW w:type="dxa" w:w="1584"/>
-            <w:shd w:fill="D9EAF7"/>
-          </w:tcPr>
-          <w:p>
-            <w:r>
-              <w:rPr>
-                <w:b/>
-              </w:rPr>
-              <w:t>Status</w:t>
-            </w:r>
-          </w:p>
-        </w:tc>
-        <w:tc>
-          <w:tcPr>
-            <w:tcW w:type="dxa" w:w="3456"/>
-            <w:shd w:fill="D9EAF7"/>
-          </w:tcPr>
-          <w:p>
-            <w:r>
-              <w:rPr>
-                <w:b/>
-              </w:rPr>
-              <w:t>Planning Note</w:t>
+              <w:t>Requirement</w:t>
             </w:r>
           </w:p>
         </w:tc>
@@ -293,41 +590,51 @@
       <w:tr>
         <w:tc>
           <w:tcPr>
-            <w:tcW w:type="dxa" w:w="3456"/>
+            <w:tcW w:type="dxa" w:w="2016"/>
+            <w:vAlign w:val="center"/>
+            <w:tcMar>
+              <w:top w:w="80" w:type="dxa"/>
+              <w:start w:w="120" w:type="dxa"/>
+              <w:bottom w:w="80" w:type="dxa"/>
+              <w:end w:w="120" w:type="dxa"/>
+            </w:tcMar>
           </w:tcPr>
           <w:p>
+            <w:pPr>
+              <w:spacing w:after="0"/>
+            </w:pPr>
             <w:r>
-              <w:t>Requirements baseline approved</w:t>
+              <w:rPr>
+                <w:rFonts w:ascii="Calibri" w:hAnsi="Calibri"/>
+                <w:color w:val="0F172A"/>
+                <w:sz w:val="18"/>
+              </w:rPr>
+              <w:t>Cost</w:t>
             </w:r>
           </w:p>
         </w:tc>
         <w:tc>
           <w:tcPr>
-            <w:tcW w:type="dxa" w:w="1728"/>
+            <w:tcW w:type="dxa" w:w="7344"/>
+            <w:vAlign w:val="center"/>
+            <w:tcMar>
+              <w:top w:w="80" w:type="dxa"/>
+              <w:start w:w="120" w:type="dxa"/>
+              <w:bottom w:w="80" w:type="dxa"/>
+              <w:end w:w="120" w:type="dxa"/>
+            </w:tcMar>
           </w:tcPr>
           <w:p>
+            <w:pPr>
+              <w:spacing w:after="0"/>
+            </w:pPr>
             <w:r>
-              <w:t>2026-01-20</w:t>
-            </w:r>
-          </w:p>
-        </w:tc>
-        <w:tc>
-          <w:tcPr>
-            <w:tcW w:type="dxa" w:w="1584"/>
-          </w:tcPr>
-          <w:p>
-            <w:r>
-              <w:t>Baseline</w:t>
-            </w:r>
-          </w:p>
-        </w:tc>
-        <w:tc>
-          <w:tcPr>
-            <w:tcW w:type="dxa" w:w="3456"/>
-          </w:tcPr>
-          <w:p>
-            <w:r>
-              <w:t>Scope signed off by product and operations</w:t>
+              <w:rPr>
+                <w:rFonts w:ascii="Calibri" w:hAnsi="Calibri"/>
+                <w:color w:val="0F172A"/>
+                <w:sz w:val="18"/>
+              </w:rPr>
+              <w:t>Compare forecast at completion with the approved budget.</w:t>
             </w:r>
           </w:p>
         </w:tc>
@@ -335,41 +642,51 @@
       <w:tr>
         <w:tc>
           <w:tcPr>
-            <w:tcW w:type="dxa" w:w="3456"/>
+            <w:tcW w:type="dxa" w:w="2016"/>
+            <w:vAlign w:val="center"/>
+            <w:tcMar>
+              <w:top w:w="80" w:type="dxa"/>
+              <w:start w:w="120" w:type="dxa"/>
+              <w:bottom w:w="80" w:type="dxa"/>
+              <w:end w:w="120" w:type="dxa"/>
+            </w:tcMar>
           </w:tcPr>
           <w:p>
+            <w:pPr>
+              <w:spacing w:after="0"/>
+            </w:pPr>
             <w:r>
-              <w:t>Data ingestion foundation complete</w:t>
+              <w:rPr>
+                <w:rFonts w:ascii="Calibri" w:hAnsi="Calibri"/>
+                <w:color w:val="0F172A"/>
+                <w:sz w:val="18"/>
+              </w:rPr>
+              <w:t>Schedule</w:t>
             </w:r>
           </w:p>
         </w:tc>
         <w:tc>
           <w:tcPr>
-            <w:tcW w:type="dxa" w:w="1728"/>
+            <w:tcW w:type="dxa" w:w="7344"/>
+            <w:vAlign w:val="center"/>
+            <w:tcMar>
+              <w:top w:w="80" w:type="dxa"/>
+              <w:start w:w="120" w:type="dxa"/>
+              <w:bottom w:w="80" w:type="dxa"/>
+              <w:end w:w="120" w:type="dxa"/>
+            </w:tcMar>
           </w:tcPr>
           <w:p>
+            <w:pPr>
+              <w:spacing w:after="0"/>
+            </w:pPr>
             <w:r>
-              <w:t>2026-02-28</w:t>
-            </w:r>
-          </w:p>
-        </w:tc>
-        <w:tc>
-          <w:tcPr>
-            <w:tcW w:type="dxa" w:w="1584"/>
-          </w:tcPr>
-          <w:p>
-            <w:r>
-              <w:t>Baseline</w:t>
-            </w:r>
-          </w:p>
-        </w:tc>
-        <w:tc>
-          <w:tcPr>
-            <w:tcW w:type="dxa" w:w="3456"/>
-          </w:tcPr>
-          <w:p>
-            <w:r>
-              <w:t>Core ingestion service and schema controls</w:t>
+              <w:rPr>
+                <w:rFonts w:ascii="Calibri" w:hAnsi="Calibri"/>
+                <w:color w:val="0F172A"/>
+                <w:sz w:val="18"/>
+              </w:rPr>
+              <w:t>Compare the current forecast date with the approved milestone date.</w:t>
             </w:r>
           </w:p>
         </w:tc>
@@ -377,41 +694,51 @@
       <w:tr>
         <w:tc>
           <w:tcPr>
-            <w:tcW w:type="dxa" w:w="3456"/>
+            <w:tcW w:type="dxa" w:w="2016"/>
+            <w:vAlign w:val="center"/>
+            <w:tcMar>
+              <w:top w:w="80" w:type="dxa"/>
+              <w:start w:w="120" w:type="dxa"/>
+              <w:bottom w:w="80" w:type="dxa"/>
+              <w:end w:w="120" w:type="dxa"/>
+            </w:tcMar>
           </w:tcPr>
           <w:p>
+            <w:pPr>
+              <w:spacing w:after="0"/>
+            </w:pPr>
             <w:r>
-              <w:t>API integration checkpoint</w:t>
+              <w:rPr>
+                <w:rFonts w:ascii="Calibri" w:hAnsi="Calibri"/>
+                <w:color w:val="0F172A"/>
+                <w:sz w:val="18"/>
+              </w:rPr>
+              <w:t>Risk</w:t>
             </w:r>
           </w:p>
         </w:tc>
         <w:tc>
           <w:tcPr>
-            <w:tcW w:type="dxa" w:w="1728"/>
+            <w:tcW w:type="dxa" w:w="7344"/>
+            <w:vAlign w:val="center"/>
+            <w:tcMar>
+              <w:top w:w="80" w:type="dxa"/>
+              <w:start w:w="120" w:type="dxa"/>
+              <w:bottom w:w="80" w:type="dxa"/>
+              <w:end w:w="120" w:type="dxa"/>
+            </w:tcMar>
           </w:tcPr>
           <w:p>
+            <w:pPr>
+              <w:spacing w:after="0"/>
+            </w:pPr>
             <w:r>
-              <w:t>2026-03-15</w:t>
-            </w:r>
-          </w:p>
-        </w:tc>
-        <w:tc>
-          <w:tcPr>
-            <w:tcW w:type="dxa" w:w="1584"/>
-          </w:tcPr>
-          <w:p>
-            <w:r>
-              <w:t>Baseline</w:t>
-            </w:r>
-          </w:p>
-        </w:tc>
-        <w:tc>
-          <w:tcPr>
-            <w:tcW w:type="dxa" w:w="3456"/>
-          </w:tcPr>
-          <w:p>
-            <w:r>
-              <w:t>External service integration and load test</w:t>
+              <w:rPr>
+                <w:rFonts w:ascii="Calibri" w:hAnsi="Calibri"/>
+                <w:color w:val="0F172A"/>
+                <w:sz w:val="18"/>
+              </w:rPr>
+              <w:t>Escalate critical risks and high risks that lack an owner or mitigation.</w:t>
             </w:r>
           </w:p>
         </w:tc>
@@ -419,103 +746,108 @@
       <w:tr>
         <w:tc>
           <w:tcPr>
-            <w:tcW w:type="dxa" w:w="3456"/>
+            <w:tcW w:type="dxa" w:w="2016"/>
+            <w:vAlign w:val="center"/>
+            <w:tcMar>
+              <w:top w:w="80" w:type="dxa"/>
+              <w:start w:w="120" w:type="dxa"/>
+              <w:bottom w:w="80" w:type="dxa"/>
+              <w:end w:w="120" w:type="dxa"/>
+            </w:tcMar>
           </w:tcPr>
           <w:p>
+            <w:pPr>
+              <w:spacing w:after="0"/>
+            </w:pPr>
             <w:r>
-              <w:t>Operational readiness review</w:t>
+              <w:rPr>
+                <w:rFonts w:ascii="Calibri" w:hAnsi="Calibri"/>
+                <w:color w:val="0F172A"/>
+                <w:sz w:val="18"/>
+              </w:rPr>
+              <w:t>Evidence</w:t>
             </w:r>
           </w:p>
         </w:tc>
         <w:tc>
           <w:tcPr>
-            <w:tcW w:type="dxa" w:w="1728"/>
+            <w:tcW w:type="dxa" w:w="7344"/>
+            <w:vAlign w:val="center"/>
+            <w:tcMar>
+              <w:top w:w="80" w:type="dxa"/>
+              <w:start w:w="120" w:type="dxa"/>
+              <w:bottom w:w="80" w:type="dxa"/>
+              <w:end w:w="120" w:type="dxa"/>
+            </w:tcMar>
           </w:tcPr>
           <w:p>
+            <w:pPr>
+              <w:spacing w:after="0"/>
+            </w:pPr>
             <w:r>
-              <w:t>2026-04-18</w:t>
-            </w:r>
-          </w:p>
-        </w:tc>
-        <w:tc>
-          <w:tcPr>
-            <w:tcW w:type="dxa" w:w="1584"/>
-          </w:tcPr>
-          <w:p>
-            <w:r>
-              <w:t>Baseline</w:t>
-            </w:r>
-          </w:p>
-        </w:tc>
-        <w:tc>
-          <w:tcPr>
-            <w:tcW w:type="dxa" w:w="3456"/>
-          </w:tcPr>
-          <w:p>
-            <w:r>
-              <w:t>Runbook and support readiness approval</w:t>
+              <w:rPr>
+                <w:rFonts w:ascii="Calibri" w:hAnsi="Calibri"/>
+                <w:color w:val="0F172A"/>
+                <w:sz w:val="18"/>
+              </w:rPr>
+              <w:t>Every conclusion must remain traceable to the source document.</w:t>
             </w:r>
           </w:p>
         </w:tc>
       </w:tr>
     </w:tbl>
     <w:p/>
-    <w:p>
-      <w:pPr>
-        <w:pStyle w:val="Heading1"/>
-      </w:pPr>
-      <w:r>
-        <w:t>Governance and Assurance Requirements</w:t>
-      </w:r>
-    </w:p>
-    <w:p>
-      <w:pPr>
-        <w:pStyle w:val="ListBullet"/>
-      </w:pPr>
-      <w:r>
-        <w:t>Monthly executive summary must compare planned progress, actual progress, cost forecast, active risk exposure, and evidence readiness.</w:t>
-      </w:r>
-    </w:p>
-    <w:p>
-      <w:pPr>
-        <w:pStyle w:val="ListBullet"/>
-      </w:pPr>
-      <w:r>
-        <w:t>Schedule variance above 10 days or a missed dependency milestone requires a named recovery owner.</w:t>
-      </w:r>
-    </w:p>
-    <w:p>
-      <w:pPr>
-        <w:pStyle w:val="ListBullet"/>
-      </w:pPr>
-      <w:r>
-        <w:t>Forecast cost above approved baseline requires finance review and mitigation options.</w:t>
-      </w:r>
-    </w:p>
-    <w:p>
-      <w:pPr>
-        <w:pStyle w:val="ListBullet"/>
-      </w:pPr>
-      <w:r>
-        <w:t>High risks, overdue high-severity issues, and missing decision evidence must be escalated to the sponsor or steering committee.</w:t>
-      </w:r>
-    </w:p>
-    <w:p>
-      <w:pPr>
-        <w:pStyle w:val="ListBullet"/>
-      </w:pPr>
-      <w:r>
-        <w:t>Every management finding should be traceable to a source document, register, or approved record.</w:t>
-      </w:r>
-    </w:p>
     <w:sectPr>
+      <w:headerReference w:type="default" r:id="rId9"/>
+      <w:footerReference w:type="default" r:id="rId10"/>
       <w:pgSz w:w="12240" w:h="15840"/>
-      <w:pgMar w:top="1440" w:right="1800" w:bottom="1440" w:left="1800" w:header="720" w:footer="720" w:gutter="0"/>
+      <w:pgMar w:top="1440" w:right="1440" w:bottom="1440" w:left="1440" w:header="708" w:footer="708" w:gutter="0"/>
       <w:cols w:space="720"/>
       <w:docGrid w:linePitch="360"/>
     </w:sectPr>
   </w:body>
 </w:document>
+</file>
+
+<file path=word/footer1.xml><?xml version="1.0" encoding="utf-8"?>
+<w:ftr xmlns:m="http://schemas.openxmlformats.org/officeDocument/2006/math" xmlns:mc="http://schemas.openxmlformats.org/markup-compatibility/2006" xmlns:mo="http://schemas.microsoft.com/office/mac/office/2008/main" xmlns:mv="urn:schemas-microsoft-com:mac:vml" xmlns:o="urn:schemas-microsoft-com:office:office" xmlns:r="http://schemas.openxmlformats.org/officeDocument/2006/relationships" xmlns:v="urn:schemas-microsoft-com:vml" xmlns:w10="urn:schemas-microsoft-com:office:word" xmlns:w14="http://schemas.microsoft.com/office/word/2010/wordml" xmlns:w="http://schemas.openxmlformats.org/wordprocessingml/2006/main" xmlns:wne="http://schemas.microsoft.com/office/word/2006/wordml" xmlns:wp14="http://schemas.microsoft.com/office/word/2010/wordprocessingDrawing" xmlns:wp="http://schemas.openxmlformats.org/drawingml/2006/wordprocessingDrawing" xmlns:wpc="http://schemas.microsoft.com/office/word/2010/wordprocessingCanvas" xmlns:wpg="http://schemas.microsoft.com/office/word/2010/wordprocessingGroup" xmlns:wpi="http://schemas.microsoft.com/office/word/2010/wordprocessingInk" xmlns:wps="http://schemas.microsoft.com/office/word/2010/wordprocessingShape" mc:Ignorable="w14 wp14">
+  <w:p>
+    <w:pPr>
+      <w:pStyle w:val="Footer"/>
+      <w:jc w:val="right"/>
+    </w:pPr>
+    <w:r>
+      <w:rPr>
+        <w:rFonts w:ascii="Calibri" w:hAnsi="Calibri"/>
+        <w:color w:val="475569"/>
+        <w:sz w:val="18"/>
+      </w:rPr>
+      <w:t xml:space="preserve">Page </w:t>
+      <w:fldChar w:fldCharType="begin"/>
+      <w:instrText xml:space="preserve"> PAGE </w:instrText>
+      <w:fldChar w:fldCharType="end"/>
+    </w:r>
+  </w:p>
+</w:ftr>
+</file>
+
+<file path=word/header1.xml><?xml version="1.0" encoding="utf-8"?>
+<w:hdr xmlns:m="http://schemas.openxmlformats.org/officeDocument/2006/math" xmlns:mc="http://schemas.openxmlformats.org/markup-compatibility/2006" xmlns:mo="http://schemas.microsoft.com/office/mac/office/2008/main" xmlns:mv="urn:schemas-microsoft-com:mac:vml" xmlns:o="urn:schemas-microsoft-com:office:office" xmlns:r="http://schemas.openxmlformats.org/officeDocument/2006/relationships" xmlns:v="urn:schemas-microsoft-com:vml" xmlns:w10="urn:schemas-microsoft-com:office:word" xmlns:w14="http://schemas.microsoft.com/office/word/2010/wordml" xmlns:w="http://schemas.openxmlformats.org/wordprocessingml/2006/main" xmlns:wne="http://schemas.microsoft.com/office/word/2006/wordml" xmlns:wp14="http://schemas.microsoft.com/office/word/2010/wordprocessingDrawing" xmlns:wp="http://schemas.openxmlformats.org/drawingml/2006/wordprocessingDrawing" xmlns:wpc="http://schemas.microsoft.com/office/word/2010/wordprocessingCanvas" xmlns:wpg="http://schemas.microsoft.com/office/word/2010/wordprocessingGroup" xmlns:wpi="http://schemas.microsoft.com/office/word/2010/wordprocessingInk" xmlns:wps="http://schemas.microsoft.com/office/word/2010/wordprocessingShape" mc:Ignorable="w14 wp14">
+  <w:p>
+    <w:pPr>
+      <w:pStyle w:val="Header"/>
+      <w:jc w:val="left"/>
+    </w:pPr>
+    <w:r>
+      <w:rPr>
+        <w:rFonts w:ascii="Calibri" w:hAnsi="Calibri"/>
+        <w:color w:val="475569"/>
+        <w:sz w:val="18"/>
+      </w:rPr>
+      <w:t>X-Assurance demo evidence | Approved baseline</w:t>
+    </w:r>
+  </w:p>
+</w:hdr>
 </file>
 
 <file path=word/numbering.xml><?xml version="1.0" encoding="utf-8"?>
@@ -881,9 +1213,13 @@
     <w:name w:val="Normal"/>
     <w:qFormat/>
     <w:rsid w:val="00FC693F"/>
+    <w:pPr>
+      <w:spacing w:before="0" w:after="120" w:line="264" w:lineRule="auto"/>
+    </w:pPr>
     <w:rPr>
-      <w:rFonts w:ascii="Arial" w:hAnsi="Arial"/>
-      <w:sz w:val="20"/>
+      <w:rFonts w:ascii="Calibri" w:hAnsi="Calibri"/>
+      <w:color w:val="0F172A"/>
+      <w:sz w:val="22"/>
     </w:rPr>
   </w:style>
   <w:style w:type="paragraph" w:styleId="Header">
@@ -941,14 +1277,14 @@
     <w:pPr>
       <w:keepNext/>
       <w:keepLines/>
-      <w:spacing w:before="480" w:after="0"/>
+      <w:spacing w:before="320" w:after="160"/>
       <w:outlineLvl w:val="0"/>
     </w:pPr>
     <w:rPr>
-      <w:rFonts w:asciiTheme="majorHAnsi" w:eastAsiaTheme="majorEastAsia" w:hAnsiTheme="majorHAnsi" w:cstheme="majorBidi" w:ascii="Arial" w:hAnsi="Arial"/>
+      <w:rFonts w:asciiTheme="majorHAnsi" w:eastAsiaTheme="majorEastAsia" w:hAnsiTheme="majorHAnsi" w:cstheme="majorBidi" w:ascii="Calibri" w:hAnsi="Calibri"/>
       <w:b/>
       <w:bCs/>
-      <w:color w:val="1F4E79"/>
+      <w:color w:val="1D4ED8"/>
       <w:sz w:val="32"/>
       <w:szCs w:val="28"/>
     </w:rPr>
@@ -965,15 +1301,15 @@
     <w:pPr>
       <w:keepNext/>
       <w:keepLines/>
-      <w:spacing w:before="200" w:after="0"/>
+      <w:spacing w:before="240" w:after="120"/>
       <w:outlineLvl w:val="1"/>
     </w:pPr>
     <w:rPr>
-      <w:rFonts w:asciiTheme="majorHAnsi" w:eastAsiaTheme="majorEastAsia" w:hAnsiTheme="majorHAnsi" w:cstheme="majorBidi" w:ascii="Arial" w:hAnsi="Arial"/>
+      <w:rFonts w:asciiTheme="majorHAnsi" w:eastAsiaTheme="majorEastAsia" w:hAnsiTheme="majorHAnsi" w:cstheme="majorBidi" w:ascii="Calibri" w:hAnsi="Calibri"/>
       <w:b/>
       <w:bCs/>
-      <w:color w:val="1F4E79"/>
-      <w:sz w:val="24"/>
+      <w:color w:val="1D4ED8"/>
+      <w:sz w:val="26"/>
       <w:szCs w:val="26"/>
     </w:rPr>
   </w:style>
@@ -989,14 +1325,15 @@
     <w:pPr>
       <w:keepNext/>
       <w:keepLines/>
-      <w:spacing w:before="200" w:after="0"/>
+      <w:spacing w:before="160" w:after="80"/>
       <w:outlineLvl w:val="2"/>
     </w:pPr>
     <w:rPr>
-      <w:rFonts w:asciiTheme="majorHAnsi" w:eastAsiaTheme="majorEastAsia" w:hAnsiTheme="majorHAnsi" w:cstheme="majorBidi"/>
+      <w:rFonts w:asciiTheme="majorHAnsi" w:eastAsiaTheme="majorEastAsia" w:hAnsiTheme="majorHAnsi" w:cstheme="majorBidi" w:ascii="Calibri" w:hAnsi="Calibri"/>
       <w:b/>
       <w:bCs/>
-      <w:color w:val="4F81BD" w:themeColor="accent1"/>
+      <w:color w:val="1E3A5F"/>
+      <w:sz w:val="24"/>
     </w:rPr>
   </w:style>
   <w:style w:type="paragraph" w:styleId="Heading4">

</xml_diff>